<commit_message>
ADAP 2023: Add Simon Albrecht as collaborator to all documents
</commit_message>
<xml_diff>
--- a/WorkEffortTable.docx
+++ b/WorkEffortTable.docx
@@ -79,19 +79,23 @@
       </w:tblPr>
       <w:tblGrid>
         <w:gridCol w:w="1507"/>
-        <w:gridCol w:w="1246"/>
-        <w:gridCol w:w="757"/>
-        <w:gridCol w:w="720"/>
+        <w:gridCol w:w="1245"/>
+        <w:gridCol w:w="1"/>
+        <w:gridCol w:w="756"/>
+        <w:gridCol w:w="1"/>
         <w:gridCol w:w="900"/>
-        <w:gridCol w:w="810"/>
-        <w:gridCol w:w="630"/>
+        <w:gridCol w:w="719"/>
+        <w:gridCol w:w="1"/>
+        <w:gridCol w:w="809"/>
+        <w:gridCol w:w="1"/>
+        <w:gridCol w:w="900"/>
         <w:gridCol w:w="810"/>
         <w:gridCol w:w="720"/>
         <w:gridCol w:w="540"/>
         <w:gridCol w:w="720"/>
         <w:gridCol w:w="720"/>
-        <w:gridCol w:w="720"/>
-        <w:gridCol w:w="967"/>
+        <w:gridCol w:w="630"/>
+        <w:gridCol w:w="787"/>
       </w:tblGrid>
       <w:tr>
         <w:trPr>
@@ -127,6 +131,7 @@
         <w:tc>
           <w:tcPr>
             <w:tcW w:w="1246" w:type="dxa"/>
+            <w:gridSpan w:val="2"/>
             <w:vMerge w:val="restart"/>
             <w:tcBorders>
               <w:top w:val="single" w:sz="4" w:space="0" w:color="000000"/>
@@ -154,7 +159,7 @@
         <w:tc>
           <w:tcPr>
             <w:tcW w:w="9014" w:type="dxa"/>
-            <w:gridSpan w:val="12"/>
+            <w:gridSpan w:val="15"/>
             <w:tcBorders>
               <w:top w:val="single" w:sz="4" w:space="0" w:color="000000"/>
               <w:left w:val="single" w:sz="4" w:space="0" w:color="000000"/>
@@ -225,6 +230,7 @@
         <w:tc>
           <w:tcPr>
             <w:tcW w:w="1246" w:type="dxa"/>
+            <w:gridSpan w:val="2"/>
             <w:vMerge w:val="continue"/>
             <w:tcBorders>
               <w:top w:val="single" w:sz="4" w:space="0" w:color="000000"/>
@@ -256,7 +262,7 @@
         <w:tc>
           <w:tcPr>
             <w:tcW w:w="2377" w:type="dxa"/>
-            <w:gridSpan w:val="3"/>
+            <w:gridSpan w:val="5"/>
             <w:tcBorders>
               <w:top w:val="single" w:sz="4" w:space="0" w:color="000000"/>
               <w:left w:val="single" w:sz="4" w:space="0" w:color="000000"/>
@@ -287,8 +293,8 @@
         </w:tc>
         <w:tc>
           <w:tcPr>
-            <w:tcW w:w="2250" w:type="dxa"/>
-            <w:gridSpan w:val="3"/>
+            <w:tcW w:w="2520" w:type="dxa"/>
+            <w:gridSpan w:val="4"/>
             <w:tcBorders>
               <w:top w:val="single" w:sz="4" w:space="0" w:color="000000"/>
               <w:left w:val="single" w:sz="4" w:space="0" w:color="000000"/>
@@ -351,7 +357,7 @@
         </w:tc>
         <w:tc>
           <w:tcPr>
-            <w:tcW w:w="2407" w:type="dxa"/>
+            <w:tcW w:w="2137" w:type="dxa"/>
             <w:gridSpan w:val="3"/>
             <w:tcBorders>
               <w:top w:val="single" w:sz="4" w:space="0" w:color="000000"/>
@@ -427,6 +433,7 @@
         <w:tc>
           <w:tcPr>
             <w:tcW w:w="1246" w:type="dxa"/>
+            <w:gridSpan w:val="2"/>
             <w:vMerge w:val="continue"/>
             <w:tcBorders>
               <w:top w:val="single" w:sz="4" w:space="0" w:color="000000"/>
@@ -458,8 +465,8 @@
         </w:tc>
         <w:tc>
           <w:tcPr>
-            <w:tcW w:w="1477" w:type="dxa"/>
-            <w:gridSpan w:val="2"/>
+            <w:tcW w:w="1657" w:type="dxa"/>
+            <w:gridSpan w:val="3"/>
             <w:tcBorders>
               <w:top w:val="single" w:sz="4" w:space="0" w:color="000000"/>
               <w:left w:val="single" w:sz="4" w:space="0" w:color="000000"/>
@@ -489,7 +496,8 @@
         </w:tc>
         <w:tc>
           <w:tcPr>
-            <w:tcW w:w="900" w:type="dxa"/>
+            <w:tcW w:w="720" w:type="dxa"/>
+            <w:gridSpan w:val="2"/>
             <w:vMerge w:val="restart"/>
             <w:tcBorders>
               <w:top w:val="single" w:sz="4" w:space="0" w:color="000000"/>
@@ -518,8 +526,8 @@
         </w:tc>
         <w:tc>
           <w:tcPr>
-            <w:tcW w:w="1440" w:type="dxa"/>
-            <w:gridSpan w:val="2"/>
+            <w:tcW w:w="1710" w:type="dxa"/>
+            <w:gridSpan w:val="3"/>
             <w:tcBorders>
               <w:top w:val="single" w:sz="4" w:space="0" w:color="000000"/>
               <w:left w:val="single" w:sz="4" w:space="0" w:color="000000"/>
@@ -636,7 +644,7 @@
         </w:tc>
         <w:tc>
           <w:tcPr>
-            <w:tcW w:w="1440" w:type="dxa"/>
+            <w:tcW w:w="1350" w:type="dxa"/>
             <w:gridSpan w:val="2"/>
             <w:tcBorders>
               <w:top w:val="single" w:sz="4" w:space="0" w:color="000000"/>
@@ -666,7 +674,7 @@
         </w:tc>
         <w:tc>
           <w:tcPr>
-            <w:tcW w:w="967" w:type="dxa"/>
+            <w:tcW w:w="787" w:type="dxa"/>
             <w:vMerge w:val="restart"/>
             <w:tcBorders>
               <w:top w:val="single" w:sz="4" w:space="0" w:color="000000"/>
@@ -750,6 +758,7 @@
         <w:tc>
           <w:tcPr>
             <w:tcW w:w="1246" w:type="dxa"/>
+            <w:gridSpan w:val="2"/>
             <w:vMerge w:val="continue"/>
             <w:tcBorders>
               <w:top w:val="single" w:sz="4" w:space="0" w:color="000000"/>
@@ -782,6 +791,7 @@
         <w:tc>
           <w:tcPr>
             <w:tcW w:w="757" w:type="dxa"/>
+            <w:gridSpan w:val="2"/>
             <w:tcBorders>
               <w:top w:val="single" w:sz="4" w:space="0" w:color="000000"/>
               <w:left w:val="single" w:sz="4" w:space="0" w:color="000000"/>
@@ -827,7 +837,7 @@
         </w:tc>
         <w:tc>
           <w:tcPr>
-            <w:tcW w:w="720" w:type="dxa"/>
+            <w:tcW w:w="900" w:type="dxa"/>
             <w:tcBorders>
               <w:top w:val="single" w:sz="4" w:space="0" w:color="000000"/>
               <w:left w:val="dashed" w:sz="4" w:space="0" w:color="000000"/>
@@ -857,7 +867,8 @@
         </w:tc>
         <w:tc>
           <w:tcPr>
-            <w:tcW w:w="900" w:type="dxa"/>
+            <w:tcW w:w="720" w:type="dxa"/>
+            <w:gridSpan w:val="2"/>
             <w:vMerge w:val="continue"/>
             <w:tcBorders>
               <w:top w:val="single" w:sz="4" w:space="0" w:color="000000"/>
@@ -893,6 +904,7 @@
         <w:tc>
           <w:tcPr>
             <w:tcW w:w="810" w:type="dxa"/>
+            <w:gridSpan w:val="2"/>
             <w:tcBorders>
               <w:top w:val="single" w:sz="4" w:space="0" w:color="000000"/>
               <w:left w:val="single" w:sz="4" w:space="0" w:color="000000"/>
@@ -938,7 +950,7 @@
         </w:tc>
         <w:tc>
           <w:tcPr>
-            <w:tcW w:w="630" w:type="dxa"/>
+            <w:tcW w:w="900" w:type="dxa"/>
             <w:tcBorders>
               <w:top w:val="single" w:sz="4" w:space="0" w:color="000000"/>
               <w:left w:val="dashed" w:sz="4" w:space="0" w:color="000000"/>
@@ -1174,7 +1186,7 @@
         </w:tc>
         <w:tc>
           <w:tcPr>
-            <w:tcW w:w="720" w:type="dxa"/>
+            <w:tcW w:w="630" w:type="dxa"/>
             <w:tcBorders>
               <w:top w:val="single" w:sz="4" w:space="0" w:color="000000"/>
               <w:left w:val="dashed" w:sz="4" w:space="0" w:color="000000"/>
@@ -1203,7 +1215,7 @@
         </w:tc>
         <w:tc>
           <w:tcPr>
-            <w:tcW w:w="967" w:type="dxa"/>
+            <w:tcW w:w="787" w:type="dxa"/>
             <w:vMerge w:val="continue"/>
             <w:tcBorders>
               <w:top w:val="single" w:sz="4" w:space="0" w:color="000000"/>
@@ -1271,6 +1283,7 @@
         <w:tc>
           <w:tcPr>
             <w:tcW w:w="1246" w:type="dxa"/>
+            <w:gridSpan w:val="2"/>
             <w:tcBorders>
               <w:top w:val="single" w:sz="4" w:space="0" w:color="000000"/>
               <w:left w:val="single" w:sz="4" w:space="0" w:color="000000"/>
@@ -1301,6 +1314,7 @@
         <w:tc>
           <w:tcPr>
             <w:tcW w:w="757" w:type="dxa"/>
+            <w:gridSpan w:val="2"/>
             <w:tcBorders>
               <w:top w:val="single" w:sz="4" w:space="0" w:color="000000"/>
               <w:left w:val="single" w:sz="4" w:space="0" w:color="000000"/>
@@ -1322,20 +1336,99 @@
                 <w:rFonts w:cs="Calibri" w:ascii="Calibri" w:hAnsi="Calibri"/>
                 <w:szCs w:val="24"/>
               </w:rPr>
-              <w:t>1</w:t>
-            </w:r>
-            <w:r>
-              <w:rPr>
-                <w:rFonts w:cs="Calibri" w:ascii="Calibri" w:hAnsi="Calibri"/>
-                <w:szCs w:val="24"/>
-              </w:rPr>
-              <w:t xml:space="preserve"> sum</w:t>
+              <w:t>1 sum</w:t>
+            </w:r>
+          </w:p>
+        </w:tc>
+        <w:tc>
+          <w:tcPr>
+            <w:tcW w:w="900" w:type="dxa"/>
+            <w:tcBorders>
+              <w:top w:val="single" w:sz="4" w:space="0" w:color="000000"/>
+              <w:left w:val="dashed" w:sz="4" w:space="0" w:color="000000"/>
+              <w:bottom w:val="single" w:sz="4" w:space="0" w:color="000000"/>
+              <w:right w:val="single" w:sz="4" w:space="0" w:color="000000"/>
+              <w:insideH w:val="single" w:sz="4" w:space="0" w:color="000000"/>
+              <w:insideV w:val="single" w:sz="4" w:space="0" w:color="000000"/>
+            </w:tcBorders>
+            <w:shd w:color="auto" w:fill="D9D9D9" w:val="clear"/>
+          </w:tcPr>
+          <w:p>
+            <w:pPr>
+              <w:pStyle w:val="Normal"/>
+              <w:ind w:left="18" w:hanging="0"/>
+              <w:rPr/>
+            </w:pPr>
+            <w:r>
+              <w:rPr>
+                <w:rFonts w:cs="Calibri" w:ascii="Calibri" w:hAnsi="Calibri"/>
+                <w:szCs w:val="24"/>
+              </w:rPr>
+              <w:t>6</w:t>
             </w:r>
           </w:p>
         </w:tc>
         <w:tc>
           <w:tcPr>
             <w:tcW w:w="720" w:type="dxa"/>
+            <w:gridSpan w:val="2"/>
+            <w:tcBorders>
+              <w:top w:val="single" w:sz="4" w:space="0" w:color="000000"/>
+              <w:left w:val="single" w:sz="4" w:space="0" w:color="000000"/>
+              <w:bottom w:val="single" w:sz="4" w:space="0" w:color="000000"/>
+              <w:right w:val="single" w:sz="4" w:space="0" w:color="000000"/>
+              <w:insideH w:val="single" w:sz="4" w:space="0" w:color="000000"/>
+              <w:insideV w:val="single" w:sz="4" w:space="0" w:color="000000"/>
+            </w:tcBorders>
+            <w:shd w:color="auto" w:fill="D9D9D9" w:val="clear"/>
+          </w:tcPr>
+          <w:p>
+            <w:pPr>
+              <w:pStyle w:val="Normal"/>
+              <w:ind w:left="18" w:hanging="0"/>
+              <w:rPr/>
+            </w:pPr>
+            <w:r>
+              <w:rPr>
+                <w:rFonts w:cs="Calibri" w:ascii="Calibri" w:hAnsi="Calibri"/>
+                <w:szCs w:val="24"/>
+              </w:rPr>
+              <w:t>0</w:t>
+            </w:r>
+          </w:p>
+        </w:tc>
+        <w:tc>
+          <w:tcPr>
+            <w:tcW w:w="810" w:type="dxa"/>
+            <w:gridSpan w:val="2"/>
+            <w:tcBorders>
+              <w:top w:val="single" w:sz="4" w:space="0" w:color="000000"/>
+              <w:left w:val="single" w:sz="4" w:space="0" w:color="000000"/>
+              <w:bottom w:val="single" w:sz="4" w:space="0" w:color="000000"/>
+              <w:right w:val="dashed" w:sz="4" w:space="0" w:color="000000"/>
+              <w:insideH w:val="single" w:sz="4" w:space="0" w:color="000000"/>
+              <w:insideV w:val="dashed" w:sz="4" w:space="0" w:color="000000"/>
+            </w:tcBorders>
+            <w:shd w:color="auto" w:fill="BFBFBF" w:val="clear"/>
+          </w:tcPr>
+          <w:p>
+            <w:pPr>
+              <w:pStyle w:val="Normal"/>
+              <w:ind w:left="18" w:hanging="0"/>
+              <w:rPr/>
+            </w:pPr>
+            <w:r>
+              <w:rPr>
+                <w:rFonts w:cs="Calibri" w:ascii="Calibri" w:hAnsi="Calibri"/>
+                <w:szCs w:val="24"/>
+              </w:rPr>
+              <w:t>1 sum</w:t>
+            </w:r>
+          </w:p>
+        </w:tc>
+        <w:tc>
+          <w:tcPr>
+            <w:tcW w:w="900" w:type="dxa"/>
             <w:tcBorders>
               <w:top w:val="single" w:sz="4" w:space="0" w:color="000000"/>
               <w:left w:val="dashed" w:sz="4" w:space="0" w:color="000000"/>
@@ -1344,29 +1437,85 @@
               <w:insideH w:val="single" w:sz="4" w:space="0" w:color="000000"/>
               <w:insideV w:val="single" w:sz="4" w:space="0" w:color="000000"/>
             </w:tcBorders>
+            <w:shd w:color="auto" w:fill="BFBFBF" w:val="clear"/>
+          </w:tcPr>
+          <w:p>
+            <w:pPr>
+              <w:pStyle w:val="Normal"/>
+              <w:ind w:left="19" w:hanging="0"/>
+              <w:rPr/>
+            </w:pPr>
+            <w:r>
+              <w:rPr>
+                <w:rFonts w:cs="Calibri" w:ascii="Calibri" w:hAnsi="Calibri"/>
+                <w:szCs w:val="24"/>
+              </w:rPr>
+              <w:t>6</w:t>
+            </w:r>
+          </w:p>
+        </w:tc>
+        <w:tc>
+          <w:tcPr>
+            <w:tcW w:w="810" w:type="dxa"/>
+            <w:tcBorders>
+              <w:top w:val="single" w:sz="4" w:space="0" w:color="000000"/>
+              <w:left w:val="single" w:sz="4" w:space="0" w:color="000000"/>
+              <w:bottom w:val="single" w:sz="4" w:space="0" w:color="000000"/>
+              <w:right w:val="single" w:sz="4" w:space="0" w:color="000000"/>
+              <w:insideH w:val="single" w:sz="4" w:space="0" w:color="000000"/>
+              <w:insideV w:val="single" w:sz="4" w:space="0" w:color="000000"/>
+            </w:tcBorders>
+            <w:shd w:color="auto" w:fill="BFBFBF" w:val="clear"/>
+          </w:tcPr>
+          <w:p>
+            <w:pPr>
+              <w:pStyle w:val="Normal"/>
+              <w:ind w:left="19" w:hanging="0"/>
+              <w:rPr/>
+            </w:pPr>
+            <w:r>
+              <w:rPr>
+                <w:rFonts w:cs="Calibri" w:ascii="Calibri" w:hAnsi="Calibri"/>
+                <w:szCs w:val="24"/>
+              </w:rPr>
+              <w:t>0</w:t>
+            </w:r>
+          </w:p>
+        </w:tc>
+        <w:tc>
+          <w:tcPr>
+            <w:tcW w:w="720" w:type="dxa"/>
+            <w:tcBorders>
+              <w:top w:val="single" w:sz="4" w:space="0" w:color="000000"/>
+              <w:left w:val="single" w:sz="4" w:space="0" w:color="000000"/>
+              <w:bottom w:val="single" w:sz="4" w:space="0" w:color="000000"/>
+              <w:right w:val="dashed" w:sz="4" w:space="0" w:color="000000"/>
+              <w:insideH w:val="single" w:sz="4" w:space="0" w:color="000000"/>
+              <w:insideV w:val="dashed" w:sz="4" w:space="0" w:color="000000"/>
+            </w:tcBorders>
             <w:shd w:color="auto" w:fill="D9D9D9" w:val="clear"/>
           </w:tcPr>
           <w:p>
             <w:pPr>
               <w:pStyle w:val="Normal"/>
-              <w:ind w:left="18" w:hanging="0"/>
-              <w:rPr/>
-            </w:pPr>
-            <w:r>
-              <w:rPr>
-                <w:rFonts w:cs="Calibri" w:ascii="Calibri" w:hAnsi="Calibri"/>
-                <w:szCs w:val="24"/>
-              </w:rPr>
-              <w:t>6</w:t>
-            </w:r>
-          </w:p>
-        </w:tc>
-        <w:tc>
-          <w:tcPr>
-            <w:tcW w:w="900" w:type="dxa"/>
-            <w:tcBorders>
-              <w:top w:val="single" w:sz="4" w:space="0" w:color="000000"/>
-              <w:left w:val="single" w:sz="4" w:space="0" w:color="000000"/>
+              <w:ind w:left="19" w:hanging="0"/>
+              <w:rPr/>
+            </w:pPr>
+            <w:r>
+              <w:rPr>
+                <w:rFonts w:cs="Calibri" w:ascii="Calibri" w:hAnsi="Calibri"/>
+                <w:szCs w:val="24"/>
+              </w:rPr>
+              <w:t>0</w:t>
+            </w:r>
+          </w:p>
+        </w:tc>
+        <w:tc>
+          <w:tcPr>
+            <w:tcW w:w="540" w:type="dxa"/>
+            <w:tcBorders>
+              <w:top w:val="single" w:sz="4" w:space="0" w:color="000000"/>
+              <w:left w:val="dashed" w:sz="4" w:space="0" w:color="000000"/>
               <w:bottom w:val="single" w:sz="4" w:space="0" w:color="000000"/>
               <w:right w:val="single" w:sz="4" w:space="0" w:color="000000"/>
               <w:insideH w:val="single" w:sz="4" w:space="0" w:color="000000"/>
@@ -1377,7 +1526,7 @@
           <w:p>
             <w:pPr>
               <w:pStyle w:val="Normal"/>
-              <w:ind w:left="18" w:hanging="0"/>
+              <w:ind w:right="42" w:hanging="0"/>
               <w:rPr/>
             </w:pPr>
             <w:r>
@@ -1391,7 +1540,35 @@
         </w:tc>
         <w:tc>
           <w:tcPr>
-            <w:tcW w:w="810" w:type="dxa"/>
+            <w:tcW w:w="720" w:type="dxa"/>
+            <w:tcBorders>
+              <w:top w:val="single" w:sz="4" w:space="0" w:color="000000"/>
+              <w:left w:val="single" w:sz="4" w:space="0" w:color="000000"/>
+              <w:bottom w:val="single" w:sz="4" w:space="0" w:color="000000"/>
+              <w:right w:val="single" w:sz="4" w:space="0" w:color="000000"/>
+              <w:insideH w:val="single" w:sz="4" w:space="0" w:color="000000"/>
+              <w:insideV w:val="single" w:sz="4" w:space="0" w:color="000000"/>
+            </w:tcBorders>
+            <w:shd w:color="auto" w:fill="D9D9D9" w:val="clear"/>
+          </w:tcPr>
+          <w:p>
+            <w:pPr>
+              <w:pStyle w:val="Normal"/>
+              <w:ind w:right="42" w:hanging="0"/>
+              <w:rPr/>
+            </w:pPr>
+            <w:r>
+              <w:rPr>
+                <w:rFonts w:cs="Calibri" w:ascii="Calibri" w:hAnsi="Calibri"/>
+                <w:szCs w:val="24"/>
+              </w:rPr>
+              <w:t>0</w:t>
+            </w:r>
+          </w:p>
+        </w:tc>
+        <w:tc>
+          <w:tcPr>
+            <w:tcW w:w="720" w:type="dxa"/>
             <w:tcBorders>
               <w:top w:val="single" w:sz="4" w:space="0" w:color="000000"/>
               <w:left w:val="single" w:sz="4" w:space="0" w:color="000000"/>
@@ -1400,20 +1577,20 @@
               <w:insideH w:val="single" w:sz="4" w:space="0" w:color="000000"/>
               <w:insideV w:val="dashed" w:sz="4" w:space="0" w:color="000000"/>
             </w:tcBorders>
-            <w:shd w:color="auto" w:fill="BFBFBF" w:val="clear"/>
-          </w:tcPr>
-          <w:p>
-            <w:pPr>
-              <w:pStyle w:val="Normal"/>
-              <w:ind w:left="18" w:hanging="0"/>
-              <w:rPr/>
-            </w:pPr>
-            <w:r>
-              <w:rPr>
-                <w:rFonts w:cs="Calibri" w:ascii="Calibri" w:hAnsi="Calibri"/>
-                <w:szCs w:val="24"/>
-              </w:rPr>
-              <w:t>1 sum</w:t>
+            <w:shd w:fill="auto" w:val="clear"/>
+          </w:tcPr>
+          <w:p>
+            <w:pPr>
+              <w:pStyle w:val="Normal"/>
+              <w:ind w:right="42" w:hanging="0"/>
+              <w:rPr/>
+            </w:pPr>
+            <w:r>
+              <w:rPr>
+                <w:rFonts w:cs="Calibri" w:ascii="Calibri" w:hAnsi="Calibri"/>
+                <w:szCs w:val="24"/>
+              </w:rPr>
+              <w:t>2 sum</w:t>
             </w:r>
           </w:p>
         </w:tc>
@@ -1428,91 +1605,7 @@
               <w:insideH w:val="single" w:sz="4" w:space="0" w:color="000000"/>
               <w:insideV w:val="single" w:sz="4" w:space="0" w:color="000000"/>
             </w:tcBorders>
-            <w:shd w:color="auto" w:fill="BFBFBF" w:val="clear"/>
-          </w:tcPr>
-          <w:p>
-            <w:pPr>
-              <w:pStyle w:val="Normal"/>
-              <w:ind w:left="19" w:hanging="0"/>
-              <w:rPr/>
-            </w:pPr>
-            <w:r>
-              <w:rPr>
-                <w:rFonts w:cs="Calibri" w:ascii="Calibri" w:hAnsi="Calibri"/>
-                <w:szCs w:val="24"/>
-              </w:rPr>
-              <w:t>6</w:t>
-            </w:r>
-          </w:p>
-        </w:tc>
-        <w:tc>
-          <w:tcPr>
-            <w:tcW w:w="810" w:type="dxa"/>
-            <w:tcBorders>
-              <w:top w:val="single" w:sz="4" w:space="0" w:color="000000"/>
-              <w:left w:val="single" w:sz="4" w:space="0" w:color="000000"/>
-              <w:bottom w:val="single" w:sz="4" w:space="0" w:color="000000"/>
-              <w:right w:val="single" w:sz="4" w:space="0" w:color="000000"/>
-              <w:insideH w:val="single" w:sz="4" w:space="0" w:color="000000"/>
-              <w:insideV w:val="single" w:sz="4" w:space="0" w:color="000000"/>
-            </w:tcBorders>
-            <w:shd w:color="auto" w:fill="BFBFBF" w:val="clear"/>
-          </w:tcPr>
-          <w:p>
-            <w:pPr>
-              <w:pStyle w:val="Normal"/>
-              <w:ind w:left="19" w:hanging="0"/>
-              <w:rPr/>
-            </w:pPr>
-            <w:r>
-              <w:rPr>
-                <w:rFonts w:cs="Calibri" w:ascii="Calibri" w:hAnsi="Calibri"/>
-                <w:szCs w:val="24"/>
-              </w:rPr>
-              <w:t>0</w:t>
-            </w:r>
-          </w:p>
-        </w:tc>
-        <w:tc>
-          <w:tcPr>
-            <w:tcW w:w="720" w:type="dxa"/>
-            <w:tcBorders>
-              <w:top w:val="single" w:sz="4" w:space="0" w:color="000000"/>
-              <w:left w:val="single" w:sz="4" w:space="0" w:color="000000"/>
-              <w:bottom w:val="single" w:sz="4" w:space="0" w:color="000000"/>
-              <w:right w:val="dashed" w:sz="4" w:space="0" w:color="000000"/>
-              <w:insideH w:val="single" w:sz="4" w:space="0" w:color="000000"/>
-              <w:insideV w:val="dashed" w:sz="4" w:space="0" w:color="000000"/>
-            </w:tcBorders>
-            <w:shd w:color="auto" w:fill="D9D9D9" w:val="clear"/>
-          </w:tcPr>
-          <w:p>
-            <w:pPr>
-              <w:pStyle w:val="Normal"/>
-              <w:ind w:left="19" w:hanging="0"/>
-              <w:rPr/>
-            </w:pPr>
-            <w:r>
-              <w:rPr>
-                <w:rFonts w:cs="Calibri" w:ascii="Calibri" w:hAnsi="Calibri"/>
-                <w:szCs w:val="24"/>
-              </w:rPr>
-              <w:t>0</w:t>
-            </w:r>
-          </w:p>
-        </w:tc>
-        <w:tc>
-          <w:tcPr>
-            <w:tcW w:w="540" w:type="dxa"/>
-            <w:tcBorders>
-              <w:top w:val="single" w:sz="4" w:space="0" w:color="000000"/>
-              <w:left w:val="dashed" w:sz="4" w:space="0" w:color="000000"/>
-              <w:bottom w:val="single" w:sz="4" w:space="0" w:color="000000"/>
-              <w:right w:val="single" w:sz="4" w:space="0" w:color="000000"/>
-              <w:insideH w:val="single" w:sz="4" w:space="0" w:color="000000"/>
-              <w:insideV w:val="single" w:sz="4" w:space="0" w:color="000000"/>
-            </w:tcBorders>
-            <w:shd w:color="auto" w:fill="D9D9D9" w:val="clear"/>
+            <w:shd w:fill="auto" w:val="clear"/>
           </w:tcPr>
           <w:p>
             <w:pPr>
@@ -1525,104 +1618,13 @@
                 <w:rFonts w:cs="Calibri" w:ascii="Calibri" w:hAnsi="Calibri"/>
                 <w:szCs w:val="24"/>
               </w:rPr>
-              <w:t>0</w:t>
-            </w:r>
-          </w:p>
-        </w:tc>
-        <w:tc>
-          <w:tcPr>
-            <w:tcW w:w="720" w:type="dxa"/>
-            <w:tcBorders>
-              <w:top w:val="single" w:sz="4" w:space="0" w:color="000000"/>
-              <w:left w:val="single" w:sz="4" w:space="0" w:color="000000"/>
-              <w:bottom w:val="single" w:sz="4" w:space="0" w:color="000000"/>
-              <w:right w:val="single" w:sz="4" w:space="0" w:color="000000"/>
-              <w:insideH w:val="single" w:sz="4" w:space="0" w:color="000000"/>
-              <w:insideV w:val="single" w:sz="4" w:space="0" w:color="000000"/>
-            </w:tcBorders>
-            <w:shd w:color="auto" w:fill="D9D9D9" w:val="clear"/>
-          </w:tcPr>
-          <w:p>
-            <w:pPr>
-              <w:pStyle w:val="Normal"/>
-              <w:ind w:right="42" w:hanging="0"/>
-              <w:rPr/>
-            </w:pPr>
-            <w:r>
-              <w:rPr>
-                <w:rFonts w:cs="Calibri" w:ascii="Calibri" w:hAnsi="Calibri"/>
-                <w:szCs w:val="24"/>
-              </w:rPr>
-              <w:t>0</w:t>
-            </w:r>
-          </w:p>
-        </w:tc>
-        <w:tc>
-          <w:tcPr>
-            <w:tcW w:w="720" w:type="dxa"/>
-            <w:tcBorders>
-              <w:top w:val="single" w:sz="4" w:space="0" w:color="000000"/>
-              <w:left w:val="single" w:sz="4" w:space="0" w:color="000000"/>
-              <w:bottom w:val="single" w:sz="4" w:space="0" w:color="000000"/>
-              <w:right w:val="dashed" w:sz="4" w:space="0" w:color="000000"/>
-              <w:insideH w:val="single" w:sz="4" w:space="0" w:color="000000"/>
-              <w:insideV w:val="dashed" w:sz="4" w:space="0" w:color="000000"/>
-            </w:tcBorders>
-            <w:shd w:fill="auto" w:val="clear"/>
-          </w:tcPr>
-          <w:p>
-            <w:pPr>
-              <w:pStyle w:val="Normal"/>
-              <w:ind w:right="42" w:hanging="0"/>
-              <w:rPr/>
-            </w:pPr>
-            <w:r>
-              <w:rPr>
-                <w:rFonts w:cs="Calibri" w:ascii="Calibri" w:hAnsi="Calibri"/>
-                <w:szCs w:val="24"/>
-              </w:rPr>
-              <w:t>2</w:t>
-            </w:r>
-            <w:r>
-              <w:rPr>
-                <w:rFonts w:cs="Calibri" w:ascii="Calibri" w:hAnsi="Calibri"/>
-                <w:szCs w:val="24"/>
-              </w:rPr>
-              <w:t xml:space="preserve"> sum</w:t>
-            </w:r>
-          </w:p>
-        </w:tc>
-        <w:tc>
-          <w:tcPr>
-            <w:tcW w:w="720" w:type="dxa"/>
-            <w:tcBorders>
-              <w:top w:val="single" w:sz="4" w:space="0" w:color="000000"/>
-              <w:left w:val="dashed" w:sz="4" w:space="0" w:color="000000"/>
-              <w:bottom w:val="single" w:sz="4" w:space="0" w:color="000000"/>
-              <w:right w:val="single" w:sz="4" w:space="0" w:color="000000"/>
-              <w:insideH w:val="single" w:sz="4" w:space="0" w:color="000000"/>
-              <w:insideV w:val="single" w:sz="4" w:space="0" w:color="000000"/>
-            </w:tcBorders>
-            <w:shd w:fill="auto" w:val="clear"/>
-          </w:tcPr>
-          <w:p>
-            <w:pPr>
-              <w:pStyle w:val="Normal"/>
-              <w:ind w:right="42" w:hanging="0"/>
-              <w:rPr/>
-            </w:pPr>
-            <w:r>
-              <w:rPr>
-                <w:rFonts w:cs="Calibri" w:ascii="Calibri" w:hAnsi="Calibri"/>
-                <w:szCs w:val="24"/>
-              </w:rPr>
               <w:t>12</w:t>
             </w:r>
           </w:p>
         </w:tc>
         <w:tc>
           <w:tcPr>
-            <w:tcW w:w="967" w:type="dxa"/>
+            <w:tcW w:w="787" w:type="dxa"/>
             <w:tcBorders>
               <w:top w:val="single" w:sz="4" w:space="0" w:color="000000"/>
               <w:left w:val="single" w:sz="4" w:space="0" w:color="000000"/>
@@ -1698,6 +1700,7 @@
         <w:tc>
           <w:tcPr>
             <w:tcW w:w="1246" w:type="dxa"/>
+            <w:gridSpan w:val="2"/>
             <w:tcBorders>
               <w:top w:val="single" w:sz="4" w:space="0" w:color="000000"/>
               <w:left w:val="single" w:sz="4" w:space="0" w:color="000000"/>
@@ -1729,6 +1732,7 @@
         <w:tc>
           <w:tcPr>
             <w:tcW w:w="757" w:type="dxa"/>
+            <w:gridSpan w:val="2"/>
             <w:tcBorders>
               <w:top w:val="single" w:sz="4" w:space="0" w:color="000000"/>
               <w:left w:val="single" w:sz="4" w:space="0" w:color="000000"/>
@@ -1756,7 +1760,93 @@
         </w:tc>
         <w:tc>
           <w:tcPr>
+            <w:tcW w:w="900" w:type="dxa"/>
+            <w:tcBorders>
+              <w:top w:val="single" w:sz="4" w:space="0" w:color="000000"/>
+              <w:left w:val="dashed" w:sz="4" w:space="0" w:color="000000"/>
+              <w:bottom w:val="single" w:sz="4" w:space="0" w:color="000000"/>
+              <w:right w:val="single" w:sz="4" w:space="0" w:color="000000"/>
+              <w:insideH w:val="single" w:sz="4" w:space="0" w:color="000000"/>
+              <w:insideV w:val="single" w:sz="4" w:space="0" w:color="000000"/>
+            </w:tcBorders>
+            <w:shd w:color="auto" w:fill="D9D9D9" w:val="clear"/>
+          </w:tcPr>
+          <w:p>
+            <w:pPr>
+              <w:pStyle w:val="Normal"/>
+              <w:ind w:left="22" w:hanging="0"/>
+              <w:rPr/>
+            </w:pPr>
+            <w:r>
+              <w:rPr>
+                <w:rFonts w:cs="Calibri" w:ascii="Calibri" w:hAnsi="Calibri"/>
+                <w:szCs w:val="24"/>
+              </w:rPr>
+              <w:t>12</w:t>
+            </w:r>
+          </w:p>
+        </w:tc>
+        <w:tc>
+          <w:tcPr>
             <w:tcW w:w="720" w:type="dxa"/>
+            <w:gridSpan w:val="2"/>
+            <w:tcBorders>
+              <w:top w:val="single" w:sz="4" w:space="0" w:color="000000"/>
+              <w:left w:val="single" w:sz="4" w:space="0" w:color="000000"/>
+              <w:bottom w:val="single" w:sz="4" w:space="0" w:color="000000"/>
+              <w:right w:val="single" w:sz="4" w:space="0" w:color="000000"/>
+              <w:insideH w:val="single" w:sz="4" w:space="0" w:color="000000"/>
+              <w:insideV w:val="single" w:sz="4" w:space="0" w:color="000000"/>
+            </w:tcBorders>
+            <w:shd w:color="auto" w:fill="D9D9D9" w:val="clear"/>
+          </w:tcPr>
+          <w:p>
+            <w:pPr>
+              <w:pStyle w:val="Normal"/>
+              <w:ind w:left="22" w:hanging="0"/>
+              <w:rPr/>
+            </w:pPr>
+            <w:r>
+              <w:rPr>
+                <w:rFonts w:cs="Calibri" w:ascii="Calibri" w:hAnsi="Calibri"/>
+                <w:szCs w:val="24"/>
+              </w:rPr>
+              <w:t>0</w:t>
+            </w:r>
+          </w:p>
+        </w:tc>
+        <w:tc>
+          <w:tcPr>
+            <w:tcW w:w="810" w:type="dxa"/>
+            <w:gridSpan w:val="2"/>
+            <w:tcBorders>
+              <w:top w:val="single" w:sz="4" w:space="0" w:color="000000"/>
+              <w:left w:val="single" w:sz="4" w:space="0" w:color="000000"/>
+              <w:bottom w:val="single" w:sz="4" w:space="0" w:color="000000"/>
+              <w:right w:val="dashed" w:sz="4" w:space="0" w:color="000000"/>
+              <w:insideH w:val="single" w:sz="4" w:space="0" w:color="000000"/>
+              <w:insideV w:val="dashed" w:sz="4" w:space="0" w:color="000000"/>
+            </w:tcBorders>
+            <w:shd w:color="auto" w:fill="BFBFBF" w:val="clear"/>
+          </w:tcPr>
+          <w:p>
+            <w:pPr>
+              <w:pStyle w:val="Normal"/>
+              <w:ind w:left="22" w:hanging="0"/>
+              <w:rPr/>
+            </w:pPr>
+            <w:r>
+              <w:rPr>
+                <w:rFonts w:cs="Calibri" w:ascii="Calibri" w:hAnsi="Calibri"/>
+                <w:szCs w:val="24"/>
+              </w:rPr>
+              <w:t>12</w:t>
+            </w:r>
+          </w:p>
+        </w:tc>
+        <w:tc>
+          <w:tcPr>
+            <w:tcW w:w="900" w:type="dxa"/>
             <w:tcBorders>
               <w:top w:val="single" w:sz="4" w:space="0" w:color="000000"/>
               <w:left w:val="dashed" w:sz="4" w:space="0" w:color="000000"/>
@@ -1765,6 +1855,62 @@
               <w:insideH w:val="single" w:sz="4" w:space="0" w:color="000000"/>
               <w:insideV w:val="single" w:sz="4" w:space="0" w:color="000000"/>
             </w:tcBorders>
+            <w:shd w:color="auto" w:fill="BFBFBF" w:val="clear"/>
+          </w:tcPr>
+          <w:p>
+            <w:pPr>
+              <w:pStyle w:val="Normal"/>
+              <w:ind w:left="22" w:hanging="0"/>
+              <w:rPr/>
+            </w:pPr>
+            <w:r>
+              <w:rPr>
+                <w:rFonts w:cs="Calibri" w:ascii="Calibri" w:hAnsi="Calibri"/>
+                <w:szCs w:val="24"/>
+              </w:rPr>
+              <w:t>12</w:t>
+            </w:r>
+          </w:p>
+        </w:tc>
+        <w:tc>
+          <w:tcPr>
+            <w:tcW w:w="810" w:type="dxa"/>
+            <w:tcBorders>
+              <w:top w:val="single" w:sz="4" w:space="0" w:color="000000"/>
+              <w:left w:val="single" w:sz="4" w:space="0" w:color="000000"/>
+              <w:bottom w:val="single" w:sz="4" w:space="0" w:color="000000"/>
+              <w:right w:val="single" w:sz="4" w:space="0" w:color="000000"/>
+              <w:insideH w:val="single" w:sz="4" w:space="0" w:color="000000"/>
+              <w:insideV w:val="single" w:sz="4" w:space="0" w:color="000000"/>
+            </w:tcBorders>
+            <w:shd w:color="auto" w:fill="BFBFBF" w:val="clear"/>
+          </w:tcPr>
+          <w:p>
+            <w:pPr>
+              <w:pStyle w:val="Normal"/>
+              <w:ind w:left="22" w:hanging="0"/>
+              <w:rPr/>
+            </w:pPr>
+            <w:r>
+              <w:rPr>
+                <w:rFonts w:cs="Calibri" w:ascii="Calibri" w:hAnsi="Calibri"/>
+                <w:szCs w:val="24"/>
+              </w:rPr>
+              <w:t>0</w:t>
+            </w:r>
+          </w:p>
+        </w:tc>
+        <w:tc>
+          <w:tcPr>
+            <w:tcW w:w="720" w:type="dxa"/>
+            <w:tcBorders>
+              <w:top w:val="single" w:sz="4" w:space="0" w:color="000000"/>
+              <w:left w:val="single" w:sz="4" w:space="0" w:color="000000"/>
+              <w:bottom w:val="single" w:sz="4" w:space="0" w:color="000000"/>
+              <w:right w:val="dashed" w:sz="4" w:space="0" w:color="000000"/>
+              <w:insideH w:val="single" w:sz="4" w:space="0" w:color="000000"/>
+              <w:insideV w:val="dashed" w:sz="4" w:space="0" w:color="000000"/>
+            </w:tcBorders>
             <w:shd w:color="auto" w:fill="D9D9D9" w:val="clear"/>
           </w:tcPr>
           <w:p>
@@ -1778,16 +1924,16 @@
                 <w:rFonts w:cs="Calibri" w:ascii="Calibri" w:hAnsi="Calibri"/>
                 <w:szCs w:val="24"/>
               </w:rPr>
-              <w:t>12</w:t>
-            </w:r>
-          </w:p>
-        </w:tc>
-        <w:tc>
-          <w:tcPr>
-            <w:tcW w:w="900" w:type="dxa"/>
-            <w:tcBorders>
-              <w:top w:val="single" w:sz="4" w:space="0" w:color="000000"/>
-              <w:left w:val="single" w:sz="4" w:space="0" w:color="000000"/>
+              <w:t>0</w:t>
+            </w:r>
+          </w:p>
+        </w:tc>
+        <w:tc>
+          <w:tcPr>
+            <w:tcW w:w="540" w:type="dxa"/>
+            <w:tcBorders>
+              <w:top w:val="single" w:sz="4" w:space="0" w:color="000000"/>
+              <w:left w:val="dashed" w:sz="4" w:space="0" w:color="000000"/>
               <w:bottom w:val="single" w:sz="4" w:space="0" w:color="000000"/>
               <w:right w:val="single" w:sz="4" w:space="0" w:color="000000"/>
               <w:insideH w:val="single" w:sz="4" w:space="0" w:color="000000"/>
@@ -1812,7 +1958,35 @@
         </w:tc>
         <w:tc>
           <w:tcPr>
-            <w:tcW w:w="810" w:type="dxa"/>
+            <w:tcW w:w="720" w:type="dxa"/>
+            <w:tcBorders>
+              <w:top w:val="single" w:sz="4" w:space="0" w:color="000000"/>
+              <w:left w:val="single" w:sz="4" w:space="0" w:color="000000"/>
+              <w:bottom w:val="single" w:sz="4" w:space="0" w:color="000000"/>
+              <w:right w:val="single" w:sz="4" w:space="0" w:color="000000"/>
+              <w:insideH w:val="single" w:sz="4" w:space="0" w:color="000000"/>
+              <w:insideV w:val="single" w:sz="4" w:space="0" w:color="000000"/>
+            </w:tcBorders>
+            <w:shd w:color="auto" w:fill="D9D9D9" w:val="clear"/>
+          </w:tcPr>
+          <w:p>
+            <w:pPr>
+              <w:pStyle w:val="Normal"/>
+              <w:ind w:left="22" w:hanging="0"/>
+              <w:rPr/>
+            </w:pPr>
+            <w:r>
+              <w:rPr>
+                <w:rFonts w:cs="Calibri" w:ascii="Calibri" w:hAnsi="Calibri"/>
+                <w:szCs w:val="24"/>
+              </w:rPr>
+              <w:t>0</w:t>
+            </w:r>
+          </w:p>
+        </w:tc>
+        <w:tc>
+          <w:tcPr>
+            <w:tcW w:w="720" w:type="dxa"/>
             <w:tcBorders>
               <w:top w:val="single" w:sz="4" w:space="0" w:color="000000"/>
               <w:left w:val="single" w:sz="4" w:space="0" w:color="000000"/>
@@ -1821,7 +1995,7 @@
               <w:insideH w:val="single" w:sz="4" w:space="0" w:color="000000"/>
               <w:insideV w:val="dashed" w:sz="4" w:space="0" w:color="000000"/>
             </w:tcBorders>
-            <w:shd w:color="auto" w:fill="BFBFBF" w:val="clear"/>
+            <w:shd w:fill="auto" w:val="clear"/>
           </w:tcPr>
           <w:p>
             <w:pPr>
@@ -1834,7 +2008,7 @@
                 <w:rFonts w:cs="Calibri" w:ascii="Calibri" w:hAnsi="Calibri"/>
                 <w:szCs w:val="24"/>
               </w:rPr>
-              <w:t>12</w:t>
+              <w:t>24</w:t>
             </w:r>
           </w:p>
         </w:tc>
@@ -1849,7 +2023,7 @@
               <w:insideH w:val="single" w:sz="4" w:space="0" w:color="000000"/>
               <w:insideV w:val="single" w:sz="4" w:space="0" w:color="000000"/>
             </w:tcBorders>
-            <w:shd w:color="auto" w:fill="BFBFBF" w:val="clear"/>
+            <w:shd w:fill="auto" w:val="clear"/>
           </w:tcPr>
           <w:p>
             <w:pPr>
@@ -1862,181 +2036,13 @@
                 <w:rFonts w:cs="Calibri" w:ascii="Calibri" w:hAnsi="Calibri"/>
                 <w:szCs w:val="24"/>
               </w:rPr>
-              <w:t>12</w:t>
-            </w:r>
-          </w:p>
-        </w:tc>
-        <w:tc>
-          <w:tcPr>
-            <w:tcW w:w="810" w:type="dxa"/>
-            <w:tcBorders>
-              <w:top w:val="single" w:sz="4" w:space="0" w:color="000000"/>
-              <w:left w:val="single" w:sz="4" w:space="0" w:color="000000"/>
-              <w:bottom w:val="single" w:sz="4" w:space="0" w:color="000000"/>
-              <w:right w:val="single" w:sz="4" w:space="0" w:color="000000"/>
-              <w:insideH w:val="single" w:sz="4" w:space="0" w:color="000000"/>
-              <w:insideV w:val="single" w:sz="4" w:space="0" w:color="000000"/>
-            </w:tcBorders>
-            <w:shd w:color="auto" w:fill="BFBFBF" w:val="clear"/>
-          </w:tcPr>
-          <w:p>
-            <w:pPr>
-              <w:pStyle w:val="Normal"/>
-              <w:ind w:left="22" w:hanging="0"/>
-              <w:rPr/>
-            </w:pPr>
-            <w:r>
-              <w:rPr>
-                <w:rFonts w:cs="Calibri" w:ascii="Calibri" w:hAnsi="Calibri"/>
-                <w:szCs w:val="24"/>
-              </w:rPr>
-              <w:t>0</w:t>
-            </w:r>
-          </w:p>
-        </w:tc>
-        <w:tc>
-          <w:tcPr>
-            <w:tcW w:w="720" w:type="dxa"/>
-            <w:tcBorders>
-              <w:top w:val="single" w:sz="4" w:space="0" w:color="000000"/>
-              <w:left w:val="single" w:sz="4" w:space="0" w:color="000000"/>
-              <w:bottom w:val="single" w:sz="4" w:space="0" w:color="000000"/>
-              <w:right w:val="dashed" w:sz="4" w:space="0" w:color="000000"/>
-              <w:insideH w:val="single" w:sz="4" w:space="0" w:color="000000"/>
-              <w:insideV w:val="dashed" w:sz="4" w:space="0" w:color="000000"/>
-            </w:tcBorders>
-            <w:shd w:color="auto" w:fill="D9D9D9" w:val="clear"/>
-          </w:tcPr>
-          <w:p>
-            <w:pPr>
-              <w:pStyle w:val="Normal"/>
-              <w:ind w:left="22" w:hanging="0"/>
-              <w:rPr/>
-            </w:pPr>
-            <w:r>
-              <w:rPr>
-                <w:rFonts w:cs="Calibri" w:ascii="Calibri" w:hAnsi="Calibri"/>
-                <w:szCs w:val="24"/>
-              </w:rPr>
-              <w:t>0</w:t>
-            </w:r>
-          </w:p>
-        </w:tc>
-        <w:tc>
-          <w:tcPr>
-            <w:tcW w:w="540" w:type="dxa"/>
-            <w:tcBorders>
-              <w:top w:val="single" w:sz="4" w:space="0" w:color="000000"/>
-              <w:left w:val="dashed" w:sz="4" w:space="0" w:color="000000"/>
-              <w:bottom w:val="single" w:sz="4" w:space="0" w:color="000000"/>
-              <w:right w:val="single" w:sz="4" w:space="0" w:color="000000"/>
-              <w:insideH w:val="single" w:sz="4" w:space="0" w:color="000000"/>
-              <w:insideV w:val="single" w:sz="4" w:space="0" w:color="000000"/>
-            </w:tcBorders>
-            <w:shd w:color="auto" w:fill="D9D9D9" w:val="clear"/>
-          </w:tcPr>
-          <w:p>
-            <w:pPr>
-              <w:pStyle w:val="Normal"/>
-              <w:ind w:left="22" w:hanging="0"/>
-              <w:rPr/>
-            </w:pPr>
-            <w:r>
-              <w:rPr>
-                <w:rFonts w:cs="Calibri" w:ascii="Calibri" w:hAnsi="Calibri"/>
-                <w:szCs w:val="24"/>
-              </w:rPr>
-              <w:t>0</w:t>
-            </w:r>
-          </w:p>
-        </w:tc>
-        <w:tc>
-          <w:tcPr>
-            <w:tcW w:w="720" w:type="dxa"/>
-            <w:tcBorders>
-              <w:top w:val="single" w:sz="4" w:space="0" w:color="000000"/>
-              <w:left w:val="single" w:sz="4" w:space="0" w:color="000000"/>
-              <w:bottom w:val="single" w:sz="4" w:space="0" w:color="000000"/>
-              <w:right w:val="single" w:sz="4" w:space="0" w:color="000000"/>
-              <w:insideH w:val="single" w:sz="4" w:space="0" w:color="000000"/>
-              <w:insideV w:val="single" w:sz="4" w:space="0" w:color="000000"/>
-            </w:tcBorders>
-            <w:shd w:color="auto" w:fill="D9D9D9" w:val="clear"/>
-          </w:tcPr>
-          <w:p>
-            <w:pPr>
-              <w:pStyle w:val="Normal"/>
-              <w:ind w:left="22" w:hanging="0"/>
-              <w:rPr/>
-            </w:pPr>
-            <w:r>
-              <w:rPr>
-                <w:rFonts w:cs="Calibri" w:ascii="Calibri" w:hAnsi="Calibri"/>
-                <w:szCs w:val="24"/>
-              </w:rPr>
-              <w:t>0</w:t>
-            </w:r>
-          </w:p>
-        </w:tc>
-        <w:tc>
-          <w:tcPr>
-            <w:tcW w:w="720" w:type="dxa"/>
-            <w:tcBorders>
-              <w:top w:val="single" w:sz="4" w:space="0" w:color="000000"/>
-              <w:left w:val="single" w:sz="4" w:space="0" w:color="000000"/>
-              <w:bottom w:val="single" w:sz="4" w:space="0" w:color="000000"/>
-              <w:right w:val="dashed" w:sz="4" w:space="0" w:color="000000"/>
-              <w:insideH w:val="single" w:sz="4" w:space="0" w:color="000000"/>
-              <w:insideV w:val="dashed" w:sz="4" w:space="0" w:color="000000"/>
-            </w:tcBorders>
-            <w:shd w:fill="auto" w:val="clear"/>
-          </w:tcPr>
-          <w:p>
-            <w:pPr>
-              <w:pStyle w:val="Normal"/>
-              <w:ind w:left="22" w:hanging="0"/>
-              <w:rPr/>
-            </w:pPr>
-            <w:r>
-              <w:rPr>
-                <w:rFonts w:cs="Calibri" w:ascii="Calibri" w:hAnsi="Calibri"/>
-                <w:szCs w:val="24"/>
-              </w:rPr>
               <w:t>24</w:t>
             </w:r>
           </w:p>
         </w:tc>
         <w:tc>
           <w:tcPr>
-            <w:tcW w:w="720" w:type="dxa"/>
-            <w:tcBorders>
-              <w:top w:val="single" w:sz="4" w:space="0" w:color="000000"/>
-              <w:left w:val="dashed" w:sz="4" w:space="0" w:color="000000"/>
-              <w:bottom w:val="single" w:sz="4" w:space="0" w:color="000000"/>
-              <w:right w:val="single" w:sz="4" w:space="0" w:color="000000"/>
-              <w:insideH w:val="single" w:sz="4" w:space="0" w:color="000000"/>
-              <w:insideV w:val="single" w:sz="4" w:space="0" w:color="000000"/>
-            </w:tcBorders>
-            <w:shd w:fill="auto" w:val="clear"/>
-          </w:tcPr>
-          <w:p>
-            <w:pPr>
-              <w:pStyle w:val="Normal"/>
-              <w:ind w:left="22" w:hanging="0"/>
-              <w:rPr/>
-            </w:pPr>
-            <w:r>
-              <w:rPr>
-                <w:rFonts w:cs="Calibri" w:ascii="Calibri" w:hAnsi="Calibri"/>
-                <w:szCs w:val="24"/>
-              </w:rPr>
-              <w:t>24</w:t>
-            </w:r>
-          </w:p>
-        </w:tc>
-        <w:tc>
-          <w:tcPr>
-            <w:tcW w:w="967" w:type="dxa"/>
+            <w:tcW w:w="787" w:type="dxa"/>
             <w:tcBorders>
               <w:top w:val="single" w:sz="4" w:space="0" w:color="000000"/>
               <w:left w:val="single" w:sz="4" w:space="0" w:color="000000"/>
@@ -2069,10 +2075,46 @@
         </w:trPr>
         <w:tc>
           <w:tcPr>
-            <w:tcW w:w="2753" w:type="dxa"/>
+            <w:tcW w:w="1507" w:type="dxa"/>
+            <w:tcBorders>
+              <w:left w:val="single" w:sz="4" w:space="0" w:color="000000"/>
+              <w:bottom w:val="single" w:sz="4" w:space="0" w:color="000000"/>
+              <w:right w:val="single" w:sz="4" w:space="0" w:color="000000"/>
+              <w:insideH w:val="single" w:sz="4" w:space="0" w:color="000000"/>
+              <w:insideV w:val="single" w:sz="4" w:space="0" w:color="000000"/>
+            </w:tcBorders>
+            <w:shd w:fill="auto" w:val="clear"/>
+          </w:tcPr>
+          <w:p>
+            <w:pPr>
+              <w:pStyle w:val="Normal"/>
+              <w:rPr>
+                <w:rFonts w:ascii="Calibri" w:hAnsi="Calibri" w:eastAsia="Times New Roman" w:cs="Calibri"/>
+                <w:color w:val="0070C0"/>
+                <w:kern w:val="0"/>
+                <w:sz w:val="20"/>
+                <w:szCs w:val="24"/>
+                <w:lang w:val="en-US" w:eastAsia="zh-CN" w:bidi="ar-SA"/>
+              </w:rPr>
+            </w:pPr>
+            <w:r>
+              <w:rPr>
+                <w:rFonts w:eastAsia="Times New Roman" w:cs="Calibri" w:ascii="Calibri" w:hAnsi="Calibri"/>
+                <w:color w:val="0070C0"/>
+                <w:kern w:val="0"/>
+                <w:sz w:val="20"/>
+                <w:szCs w:val="24"/>
+                <w:lang w:val="en-US" w:eastAsia="zh-CN" w:bidi="ar-SA"/>
+              </w:rPr>
+              <w:t>Simon Albrecht</w:t>
+            </w:r>
+          </w:p>
+        </w:tc>
+        <w:tc>
+          <w:tcPr>
+            <w:tcW w:w="1246" w:type="dxa"/>
             <w:gridSpan w:val="2"/>
             <w:tcBorders>
-              <w:top w:val="single" w:sz="4" w:space="0" w:color="000000"/>
               <w:left w:val="single" w:sz="4" w:space="0" w:color="000000"/>
               <w:bottom w:val="single" w:sz="4" w:space="0" w:color="000000"/>
               <w:right w:val="single" w:sz="4" w:space="0" w:color="000000"/>
@@ -2085,6 +2127,368 @@
           <w:p>
             <w:pPr>
               <w:pStyle w:val="Normal"/>
+              <w:ind w:right="34" w:hanging="0"/>
+              <w:jc w:val="center"/>
+              <w:rPr>
+                <w:rFonts w:ascii="Calibri" w:hAnsi="Calibri" w:eastAsia="Times New Roman" w:cs="Calibri"/>
+                <w:color w:val="0070C0"/>
+                <w:kern w:val="0"/>
+                <w:sz w:val="20"/>
+                <w:szCs w:val="24"/>
+                <w:lang w:val="en-US" w:eastAsia="zh-CN" w:bidi="ar-SA"/>
+              </w:rPr>
+            </w:pPr>
+            <w:r>
+              <w:rPr>
+                <w:rFonts w:eastAsia="Times New Roman" w:cs="Calibri" w:ascii="Calibri" w:hAnsi="Calibri"/>
+                <w:color w:val="0070C0"/>
+                <w:kern w:val="0"/>
+                <w:sz w:val="20"/>
+                <w:szCs w:val="24"/>
+                <w:lang w:val="en-US" w:eastAsia="zh-CN" w:bidi="ar-SA"/>
+              </w:rPr>
+              <w:t>Collaborator</w:t>
+            </w:r>
+          </w:p>
+        </w:tc>
+        <w:tc>
+          <w:tcPr>
+            <w:tcW w:w="757" w:type="dxa"/>
+            <w:gridSpan w:val="2"/>
+            <w:tcBorders>
+              <w:left w:val="single" w:sz="4" w:space="0" w:color="000000"/>
+              <w:bottom w:val="single" w:sz="4" w:space="0" w:color="000000"/>
+              <w:right w:val="dashed" w:sz="4" w:space="0" w:color="000000"/>
+              <w:insideH w:val="single" w:sz="4" w:space="0" w:color="000000"/>
+              <w:insideV w:val="dashed" w:sz="4" w:space="0" w:color="000000"/>
+            </w:tcBorders>
+            <w:shd w:color="auto" w:fill="D9D9D9" w:val="clear"/>
+          </w:tcPr>
+          <w:p>
+            <w:pPr>
+              <w:pStyle w:val="Normal"/>
+              <w:ind w:left="22" w:hanging="0"/>
+              <w:rPr/>
+            </w:pPr>
+            <w:r>
+              <w:rPr/>
+              <w:t>0</w:t>
+            </w:r>
+          </w:p>
+        </w:tc>
+        <w:tc>
+          <w:tcPr>
+            <w:tcW w:w="900" w:type="dxa"/>
+            <w:tcBorders>
+              <w:left w:val="dashed" w:sz="4" w:space="0" w:color="000000"/>
+              <w:bottom w:val="single" w:sz="4" w:space="0" w:color="000000"/>
+              <w:right w:val="single" w:sz="4" w:space="0" w:color="000000"/>
+              <w:insideH w:val="single" w:sz="4" w:space="0" w:color="000000"/>
+              <w:insideV w:val="single" w:sz="4" w:space="0" w:color="000000"/>
+            </w:tcBorders>
+            <w:shd w:color="auto" w:fill="D9D9D9" w:val="clear"/>
+          </w:tcPr>
+          <w:p>
+            <w:pPr>
+              <w:pStyle w:val="Normal"/>
+              <w:ind w:left="22" w:hanging="0"/>
+              <w:rPr/>
+            </w:pPr>
+            <w:bookmarkStart w:id="0" w:name="__DdeLink__23009_1844428681"/>
+            <w:r>
+              <w:rPr/>
+              <w:t xml:space="preserve">De </w:t>
+            </w:r>
+          </w:p>
+          <w:p>
+            <w:pPr>
+              <w:pStyle w:val="Normal"/>
+              <w:ind w:left="22" w:hanging="0"/>
+              <w:rPr/>
+            </w:pPr>
+            <w:bookmarkStart w:id="1" w:name="__DdeLink__23009_1844428681"/>
+            <w:r>
+              <w:rPr/>
+              <w:t>minimis</w:t>
+            </w:r>
+            <w:bookmarkEnd w:id="1"/>
+          </w:p>
+        </w:tc>
+        <w:tc>
+          <w:tcPr>
+            <w:tcW w:w="720" w:type="dxa"/>
+            <w:gridSpan w:val="2"/>
+            <w:tcBorders>
+              <w:left w:val="single" w:sz="4" w:space="0" w:color="000000"/>
+              <w:bottom w:val="single" w:sz="4" w:space="0" w:color="000000"/>
+              <w:right w:val="single" w:sz="4" w:space="0" w:color="000000"/>
+              <w:insideH w:val="single" w:sz="4" w:space="0" w:color="000000"/>
+              <w:insideV w:val="single" w:sz="4" w:space="0" w:color="000000"/>
+            </w:tcBorders>
+            <w:shd w:color="auto" w:fill="D9D9D9" w:val="clear"/>
+          </w:tcPr>
+          <w:p>
+            <w:pPr>
+              <w:pStyle w:val="Normal"/>
+              <w:ind w:left="22" w:hanging="0"/>
+              <w:rPr/>
+            </w:pPr>
+            <w:r>
+              <w:rPr/>
+              <w:t>0</w:t>
+            </w:r>
+          </w:p>
+        </w:tc>
+        <w:tc>
+          <w:tcPr>
+            <w:tcW w:w="810" w:type="dxa"/>
+            <w:gridSpan w:val="2"/>
+            <w:tcBorders>
+              <w:left w:val="single" w:sz="4" w:space="0" w:color="000000"/>
+              <w:bottom w:val="single" w:sz="4" w:space="0" w:color="000000"/>
+              <w:right w:val="dashed" w:sz="4" w:space="0" w:color="000000"/>
+              <w:insideH w:val="single" w:sz="4" w:space="0" w:color="000000"/>
+              <w:insideV w:val="dashed" w:sz="4" w:space="0" w:color="000000"/>
+            </w:tcBorders>
+            <w:shd w:color="auto" w:fill="BFBFBF" w:val="clear"/>
+          </w:tcPr>
+          <w:p>
+            <w:pPr>
+              <w:pStyle w:val="Normal"/>
+              <w:ind w:left="22" w:hanging="0"/>
+              <w:rPr/>
+            </w:pPr>
+            <w:r>
+              <w:rPr/>
+              <w:t>0</w:t>
+            </w:r>
+          </w:p>
+        </w:tc>
+        <w:tc>
+          <w:tcPr>
+            <w:tcW w:w="900" w:type="dxa"/>
+            <w:tcBorders>
+              <w:left w:val="dashed" w:sz="4" w:space="0" w:color="000000"/>
+              <w:bottom w:val="single" w:sz="4" w:space="0" w:color="000000"/>
+              <w:right w:val="single" w:sz="4" w:space="0" w:color="000000"/>
+              <w:insideH w:val="single" w:sz="4" w:space="0" w:color="000000"/>
+              <w:insideV w:val="single" w:sz="4" w:space="0" w:color="000000"/>
+            </w:tcBorders>
+            <w:shd w:color="auto" w:fill="BFBFBF" w:val="clear"/>
+          </w:tcPr>
+          <w:p>
+            <w:pPr>
+              <w:pStyle w:val="Normal"/>
+              <w:ind w:left="22" w:hanging="0"/>
+              <w:rPr/>
+            </w:pPr>
+            <w:r>
+              <w:rPr/>
+              <w:t xml:space="preserve">De </w:t>
+            </w:r>
+          </w:p>
+          <w:p>
+            <w:pPr>
+              <w:pStyle w:val="Normal"/>
+              <w:ind w:left="22" w:hanging="0"/>
+              <w:rPr/>
+            </w:pPr>
+            <w:r>
+              <w:rPr/>
+              <w:t>minimis</w:t>
+            </w:r>
+          </w:p>
+        </w:tc>
+        <w:tc>
+          <w:tcPr>
+            <w:tcW w:w="810" w:type="dxa"/>
+            <w:tcBorders>
+              <w:left w:val="single" w:sz="4" w:space="0" w:color="000000"/>
+              <w:bottom w:val="single" w:sz="4" w:space="0" w:color="000000"/>
+              <w:right w:val="single" w:sz="4" w:space="0" w:color="000000"/>
+              <w:insideH w:val="single" w:sz="4" w:space="0" w:color="000000"/>
+              <w:insideV w:val="single" w:sz="4" w:space="0" w:color="000000"/>
+            </w:tcBorders>
+            <w:shd w:color="auto" w:fill="BFBFBF" w:val="clear"/>
+          </w:tcPr>
+          <w:p>
+            <w:pPr>
+              <w:pStyle w:val="Normal"/>
+              <w:ind w:left="22" w:hanging="0"/>
+              <w:rPr/>
+            </w:pPr>
+            <w:r>
+              <w:rPr/>
+              <w:t>0</w:t>
+            </w:r>
+          </w:p>
+        </w:tc>
+        <w:tc>
+          <w:tcPr>
+            <w:tcW w:w="720" w:type="dxa"/>
+            <w:tcBorders>
+              <w:left w:val="single" w:sz="4" w:space="0" w:color="000000"/>
+              <w:bottom w:val="single" w:sz="4" w:space="0" w:color="000000"/>
+              <w:right w:val="dashed" w:sz="4" w:space="0" w:color="000000"/>
+              <w:insideH w:val="single" w:sz="4" w:space="0" w:color="000000"/>
+              <w:insideV w:val="dashed" w:sz="4" w:space="0" w:color="000000"/>
+            </w:tcBorders>
+            <w:shd w:color="auto" w:fill="D9D9D9" w:val="clear"/>
+          </w:tcPr>
+          <w:p>
+            <w:pPr>
+              <w:pStyle w:val="Normal"/>
+              <w:ind w:left="22" w:hanging="0"/>
+              <w:rPr/>
+            </w:pPr>
+            <w:r>
+              <w:rPr/>
+              <w:t>0</w:t>
+            </w:r>
+          </w:p>
+        </w:tc>
+        <w:tc>
+          <w:tcPr>
+            <w:tcW w:w="540" w:type="dxa"/>
+            <w:tcBorders>
+              <w:left w:val="dashed" w:sz="4" w:space="0" w:color="000000"/>
+              <w:bottom w:val="single" w:sz="4" w:space="0" w:color="000000"/>
+              <w:right w:val="single" w:sz="4" w:space="0" w:color="000000"/>
+              <w:insideH w:val="single" w:sz="4" w:space="0" w:color="000000"/>
+              <w:insideV w:val="single" w:sz="4" w:space="0" w:color="000000"/>
+            </w:tcBorders>
+            <w:shd w:color="auto" w:fill="D9D9D9" w:val="clear"/>
+          </w:tcPr>
+          <w:p>
+            <w:pPr>
+              <w:pStyle w:val="Normal"/>
+              <w:ind w:left="22" w:hanging="0"/>
+              <w:rPr/>
+            </w:pPr>
+            <w:r>
+              <w:rPr/>
+              <w:t>0</w:t>
+            </w:r>
+          </w:p>
+        </w:tc>
+        <w:tc>
+          <w:tcPr>
+            <w:tcW w:w="720" w:type="dxa"/>
+            <w:tcBorders>
+              <w:left w:val="single" w:sz="4" w:space="0" w:color="000000"/>
+              <w:bottom w:val="single" w:sz="4" w:space="0" w:color="000000"/>
+              <w:right w:val="single" w:sz="4" w:space="0" w:color="000000"/>
+              <w:insideH w:val="single" w:sz="4" w:space="0" w:color="000000"/>
+              <w:insideV w:val="single" w:sz="4" w:space="0" w:color="000000"/>
+            </w:tcBorders>
+            <w:shd w:color="auto" w:fill="D9D9D9" w:val="clear"/>
+          </w:tcPr>
+          <w:p>
+            <w:pPr>
+              <w:pStyle w:val="Normal"/>
+              <w:ind w:left="22" w:hanging="0"/>
+              <w:rPr/>
+            </w:pPr>
+            <w:r>
+              <w:rPr/>
+              <w:t>0</w:t>
+            </w:r>
+          </w:p>
+        </w:tc>
+        <w:tc>
+          <w:tcPr>
+            <w:tcW w:w="720" w:type="dxa"/>
+            <w:tcBorders>
+              <w:left w:val="single" w:sz="4" w:space="0" w:color="000000"/>
+              <w:bottom w:val="single" w:sz="4" w:space="0" w:color="000000"/>
+              <w:right w:val="dashed" w:sz="4" w:space="0" w:color="000000"/>
+              <w:insideH w:val="single" w:sz="4" w:space="0" w:color="000000"/>
+              <w:insideV w:val="dashed" w:sz="4" w:space="0" w:color="000000"/>
+            </w:tcBorders>
+            <w:shd w:fill="auto" w:val="clear"/>
+          </w:tcPr>
+          <w:p>
+            <w:pPr>
+              <w:pStyle w:val="Normal"/>
+              <w:ind w:left="22" w:hanging="0"/>
+              <w:rPr/>
+            </w:pPr>
+            <w:r>
+              <w:rPr/>
+              <w:t>0</w:t>
+            </w:r>
+          </w:p>
+        </w:tc>
+        <w:tc>
+          <w:tcPr>
+            <w:tcW w:w="630" w:type="dxa"/>
+            <w:tcBorders>
+              <w:left w:val="dashed" w:sz="4" w:space="0" w:color="000000"/>
+              <w:bottom w:val="single" w:sz="4" w:space="0" w:color="000000"/>
+              <w:right w:val="single" w:sz="4" w:space="0" w:color="000000"/>
+              <w:insideH w:val="single" w:sz="4" w:space="0" w:color="000000"/>
+              <w:insideV w:val="single" w:sz="4" w:space="0" w:color="000000"/>
+            </w:tcBorders>
+            <w:shd w:fill="auto" w:val="clear"/>
+          </w:tcPr>
+          <w:p>
+            <w:pPr>
+              <w:pStyle w:val="Normal"/>
+              <w:ind w:left="22" w:hanging="0"/>
+              <w:rPr/>
+            </w:pPr>
+            <w:r>
+              <w:rPr/>
+            </w:r>
+          </w:p>
+        </w:tc>
+        <w:tc>
+          <w:tcPr>
+            <w:tcW w:w="787" w:type="dxa"/>
+            <w:tcBorders>
+              <w:left w:val="single" w:sz="4" w:space="0" w:color="000000"/>
+              <w:bottom w:val="single" w:sz="4" w:space="0" w:color="000000"/>
+              <w:right w:val="single" w:sz="4" w:space="0" w:color="000000"/>
+              <w:insideH w:val="single" w:sz="4" w:space="0" w:color="000000"/>
+              <w:insideV w:val="single" w:sz="4" w:space="0" w:color="000000"/>
+            </w:tcBorders>
+            <w:shd w:fill="auto" w:val="clear"/>
+          </w:tcPr>
+          <w:p>
+            <w:pPr>
+              <w:pStyle w:val="Normal"/>
+              <w:ind w:left="22" w:hanging="0"/>
+              <w:rPr/>
+            </w:pPr>
+            <w:r>
+              <w:rPr/>
+              <w:t>0</w:t>
+            </w:r>
+          </w:p>
+        </w:tc>
+      </w:tr>
+      <w:tr>
+        <w:trPr>
+          <w:trHeight w:val="230" w:hRule="atLeast"/>
+        </w:trPr>
+        <w:tc>
+          <w:tcPr>
+            <w:tcW w:w="2752" w:type="dxa"/>
+            <w:gridSpan w:val="2"/>
+            <w:tcBorders>
+              <w:top w:val="single" w:sz="4" w:space="0" w:color="000000"/>
+              <w:left w:val="single" w:sz="4" w:space="0" w:color="000000"/>
+              <w:bottom w:val="single" w:sz="4" w:space="0" w:color="000000"/>
+              <w:right w:val="single" w:sz="4" w:space="0" w:color="000000"/>
+              <w:insideH w:val="single" w:sz="4" w:space="0" w:color="000000"/>
+              <w:insideV w:val="single" w:sz="4" w:space="0" w:color="000000"/>
+            </w:tcBorders>
+            <w:shd w:fill="auto" w:val="clear"/>
+            <w:vAlign w:val="center"/>
+          </w:tcPr>
+          <w:p>
+            <w:pPr>
+              <w:pStyle w:val="Normal"/>
               <w:rPr/>
             </w:pPr>
             <w:r>
@@ -2100,6 +2504,7 @@
         <w:tc>
           <w:tcPr>
             <w:tcW w:w="757" w:type="dxa"/>
+            <w:gridSpan w:val="2"/>
             <w:tcBorders>
               <w:top w:val="single" w:sz="4" w:space="0" w:color="000000"/>
               <w:left w:val="single" w:sz="4" w:space="0" w:color="000000"/>
@@ -2121,20 +2526,14 @@
                 <w:rFonts w:cs="Calibri" w:ascii="Calibri" w:hAnsi="Calibri"/>
                 <w:szCs w:val="24"/>
               </w:rPr>
-              <w:t>1</w:t>
-            </w:r>
-            <w:r>
-              <w:rPr>
-                <w:rFonts w:cs="Calibri" w:ascii="Calibri" w:hAnsi="Calibri"/>
-                <w:szCs w:val="24"/>
-              </w:rPr>
-              <w:t>3</w:t>
-            </w:r>
-          </w:p>
-        </w:tc>
-        <w:tc>
-          <w:tcPr>
-            <w:tcW w:w="720" w:type="dxa"/>
+              <w:t>13</w:t>
+            </w:r>
+          </w:p>
+        </w:tc>
+        <w:tc>
+          <w:tcPr>
+            <w:tcW w:w="901" w:type="dxa"/>
+            <w:gridSpan w:val="2"/>
             <w:tcBorders>
               <w:top w:val="single" w:sz="4" w:space="0" w:color="000000"/>
               <w:left w:val="dashed" w:sz="4" w:space="0" w:color="000000"/>
@@ -2163,7 +2562,7 @@
         </w:tc>
         <w:tc>
           <w:tcPr>
-            <w:tcW w:w="900" w:type="dxa"/>
+            <w:tcW w:w="719" w:type="dxa"/>
             <w:tcBorders>
               <w:top w:val="single" w:sz="4" w:space="0" w:color="000000"/>
               <w:left w:val="single" w:sz="4" w:space="0" w:color="000000"/>
@@ -2196,6 +2595,7 @@
         <w:tc>
           <w:tcPr>
             <w:tcW w:w="810" w:type="dxa"/>
+            <w:gridSpan w:val="2"/>
             <w:tcBorders>
               <w:top w:val="single" w:sz="4" w:space="0" w:color="000000"/>
               <w:left w:val="single" w:sz="4" w:space="0" w:color="000000"/>
@@ -2223,7 +2623,8 @@
         </w:tc>
         <w:tc>
           <w:tcPr>
-            <w:tcW w:w="630" w:type="dxa"/>
+            <w:tcW w:w="901" w:type="dxa"/>
+            <w:gridSpan w:val="2"/>
             <w:tcBorders>
               <w:top w:val="single" w:sz="4" w:space="0" w:color="000000"/>
               <w:left w:val="dashed" w:sz="4" w:space="0" w:color="000000"/>
@@ -2400,7 +2801,7 @@
         </w:tc>
         <w:tc>
           <w:tcPr>
-            <w:tcW w:w="720" w:type="dxa"/>
+            <w:tcW w:w="630" w:type="dxa"/>
             <w:tcBorders>
               <w:top w:val="single" w:sz="4" w:space="0" w:color="000000"/>
               <w:left w:val="dashed" w:sz="4" w:space="0" w:color="000000"/>
@@ -2429,7 +2830,7 @@
         </w:tc>
         <w:tc>
           <w:tcPr>
-            <w:tcW w:w="967" w:type="dxa"/>
+            <w:tcW w:w="787" w:type="dxa"/>
             <w:tcBorders>
               <w:top w:val="single" w:sz="4" w:space="0" w:color="000000"/>
               <w:left w:val="single" w:sz="4" w:space="0" w:color="000000"/>
@@ -2464,7 +2865,7 @@
         <w:tc>
           <w:tcPr>
             <w:tcW w:w="11767" w:type="dxa"/>
-            <w:gridSpan w:val="14"/>
+            <w:gridSpan w:val="18"/>
             <w:tcBorders>
               <w:top w:val="single" w:sz="4" w:space="0" w:color="000000"/>
               <w:left w:val="single" w:sz="4" w:space="0" w:color="000000"/>

</xml_diff>